<commit_message>
Updated county question, updated ilao link name and url
</commit_message>
<xml_diff>
--- a/docassemble/PowerOfAttorneyRevocation/data/templates/poa_revocation_health.docx
+++ b/docassemble/PowerOfAttorneyRevocation/data/templates/poa_revocation_health.docx
@@ -93,15 +93,7 @@
         <w:t>(</w:t>
       </w:r>
       <w:r>
-        <w:t>bare</w:t>
-      </w:r>
-      <w:proofErr w:type="gramStart"/>
-      <w:r>
-        <w:t>=”True</w:t>
-      </w:r>
-      <w:proofErr w:type="gramEnd"/>
-      <w:r>
-        <w:t>”</w:t>
+        <w:t>bare=True</w:t>
       </w:r>
       <w:proofErr w:type="gramStart"/>
       <w:r>
@@ -482,15 +474,7 @@
         <w:t>(</w:t>
       </w:r>
       <w:r>
-        <w:t>bare</w:t>
-      </w:r>
-      <w:proofErr w:type="gramStart"/>
-      <w:r>
-        <w:t>=”True</w:t>
-      </w:r>
-      <w:proofErr w:type="gramEnd"/>
-      <w:r>
-        <w:t>”</w:t>
+        <w:t>bare=True</w:t>
       </w:r>
       <w:proofErr w:type="gramStart"/>
       <w:r>
@@ -705,15 +689,7 @@
       </w:r>
       <w:proofErr w:type="spellEnd"/>
       <w:r>
-        <w:t>(bare</w:t>
-      </w:r>
-      <w:proofErr w:type="gramStart"/>
-      <w:r>
-        <w:t>=”True</w:t>
-      </w:r>
-      <w:proofErr w:type="gramEnd"/>
-      <w:r>
-        <w:t>”)</w:t>
+        <w:t>(bare=True)</w:t>
       </w:r>
       <w:proofErr w:type="gramStart"/>
       <w:r>
@@ -740,11 +716,11 @@
       </w:r>
       <w:proofErr w:type="gramEnd"/>
       <w:r>
-        <w:t>_address_1}}, {{</w:t>
-      </w:r>
-      <w:proofErr w:type="gramStart"/>
-      <w:r>
-        <w:t>person.intl</w:t>
+        <w:t>_address_</w:t>
+      </w:r>
+      <w:proofErr w:type="gramStart"/>
+      <w:r>
+        <w:t>1}}, {{person.intl</w:t>
       </w:r>
       <w:proofErr w:type="gramEnd"/>
       <w:r>
@@ -756,8 +732,13 @@
       </w:r>
       <w:proofErr w:type="gramEnd"/>
       <w:r>
-        <w:t>% endif %}</w:t>
-      </w:r>
+        <w:t xml:space="preserve">% </w:t>
+      </w:r>
+      <w:proofErr w:type="gramStart"/>
+      <w:r>
+        <w:t>endif %}</w:t>
+      </w:r>
+      <w:proofErr w:type="gramEnd"/>
     </w:p>
     <w:p>
       <w:pPr>

</xml_diff>